<commit_message>
fix(sentinel-demo): rename VP title to vice premier ministre
</commit_message>
<xml_diff>
--- a/docs/sentinel-ci-demo-trame-presenter-card-2026-05-25.docx
+++ b/docs/sentinel-ci-demo-trame-presenter-card-2026-05-25.docx
@@ -8,7 +8,7 @@
         <w:spacing w:before="0" w:after="80" w:line="276" w:lineRule="auto"/>
       </w:pPr>
       <w:r>
-        <w:t>SENTINEL-CI — Carte de trame VP · 25 mai 2026</w:t>
+        <w:t>SENTINEL-CI — Carte de trame Vice Premier Ministre · 25 mai 2026</w:t>
       </w:r>
     </w:p>
     <w:p>
@@ -187,7 +187,7 @@
           <w:color w:val="121822"/>
           <w:sz w:val="21"/>
         </w:rPr>
-        <w:t>« Monsieur le Vice-Président, la zone Nord est tendue : projet drone Napié, retard cargo, dédouanement à Vridi. »</w:t>
+        <w:t>« Monsieur le Vice Premier Ministre, la zone Nord est tendue : projet drone Napié, retard cargo, dédouanement à Vridi. »</w:t>
       </w:r>
     </w:p>
     <w:p>

</xml_diff>